<commit_message>
update RO TECHNICAL REPORT.docx file
</commit_message>
<xml_diff>
--- a/RO TECHNICAL REPORT.docx
+++ b/RO TECHNICAL REPORT.docx
@@ -95,11 +95,6 @@
         </w:rPr>
         <w:t>TECHNICAL FEASIBILITY &amp; IMPACT REPORT</w:t>
       </w:r>
-    </w:p>
-    <w:p>
-      <w:pPr>
-        <w:spacing w:before="300"/>
-      </w:pPr>
     </w:p>
     <w:tbl>
       <w:tblPr>
@@ -124,12 +119,6 @@
         <w:gridCol w:w="5400"/>
       </w:tblGrid>
       <w:tr>
-        <w:tblPrEx>
-          <w:tblCellMar>
-            <w:top w:w="0" w:type="dxa"/>
-            <w:bottom w:w="0" w:type="dxa"/>
-          </w:tblCellMar>
-        </w:tblPrEx>
         <w:trPr>
           <w:jc w:val="center"/>
         </w:trPr>
@@ -160,7 +149,7 @@
                 <w:sz w:val="21"/>
                 <w:szCs w:val="21"/>
               </w:rPr>
-              <w:t>Project Code</w:t>
+              <w:t>Classification</w:t>
             </w:r>
           </w:p>
         </w:tc>
@@ -173,33 +162,27 @@
               <w:bottom w:val="single" w:sz="4" w:space="0" w:color="D9DDE1"/>
               <w:right w:val="single" w:sz="4" w:space="0" w:color="D9DDE1"/>
             </w:tcBorders>
-            <w:shd w:val="clear" w:color="auto" w:fill="F4F6F8"/>
-            <w:tcMar>
-              <w:top w:w="80" w:type="dxa"/>
-              <w:left w:w="150" w:type="dxa"/>
-              <w:bottom w:w="80" w:type="dxa"/>
-              <w:right w:w="150" w:type="dxa"/>
-            </w:tcMar>
-            <w:vAlign w:val="center"/>
-          </w:tcPr>
-          <w:p>
-            <w:r>
-              <w:rPr>
-                <w:sz w:val="21"/>
-                <w:szCs w:val="21"/>
-              </w:rPr>
-              <w:t>UWSI-RO-2025-001</w:t>
+            <w:shd w:val="clear" w:color="auto" w:fill="FFFFFF"/>
+            <w:tcMar>
+              <w:top w:w="80" w:type="dxa"/>
+              <w:left w:w="150" w:type="dxa"/>
+              <w:bottom w:w="80" w:type="dxa"/>
+              <w:right w:w="150" w:type="dxa"/>
+            </w:tcMar>
+            <w:vAlign w:val="center"/>
+          </w:tcPr>
+          <w:p>
+            <w:r>
+              <w:rPr>
+                <w:sz w:val="21"/>
+                <w:szCs w:val="21"/>
+              </w:rPr>
+              <w:t>Technical Proposal / Community Infrastructure</w:t>
             </w:r>
           </w:p>
         </w:tc>
       </w:tr>
       <w:tr>
-        <w:tblPrEx>
-          <w:tblCellMar>
-            <w:top w:w="0" w:type="dxa"/>
-            <w:bottom w:w="0" w:type="dxa"/>
-          </w:tblCellMar>
-        </w:tblPrEx>
         <w:trPr>
           <w:jc w:val="center"/>
         </w:trPr>
@@ -230,7 +213,7 @@
                 <w:sz w:val="21"/>
                 <w:szCs w:val="21"/>
               </w:rPr>
-              <w:t>Classification</w:t>
+              <w:t>Prepared By</w:t>
             </w:r>
           </w:p>
         </w:tc>
@@ -243,33 +226,28 @@
               <w:bottom w:val="single" w:sz="4" w:space="0" w:color="D9DDE1"/>
               <w:right w:val="single" w:sz="4" w:space="0" w:color="D9DDE1"/>
             </w:tcBorders>
-            <w:shd w:val="clear" w:color="auto" w:fill="FFFFFF"/>
-            <w:tcMar>
-              <w:top w:w="80" w:type="dxa"/>
-              <w:left w:w="150" w:type="dxa"/>
-              <w:bottom w:w="80" w:type="dxa"/>
-              <w:right w:w="150" w:type="dxa"/>
-            </w:tcMar>
-            <w:vAlign w:val="center"/>
-          </w:tcPr>
-          <w:p>
-            <w:r>
-              <w:rPr>
-                <w:sz w:val="21"/>
-                <w:szCs w:val="21"/>
-              </w:rPr>
-              <w:t>Technical Proposal / Community Infrastructure</w:t>
+            <w:shd w:val="clear" w:color="auto" w:fill="F4F6F8"/>
+            <w:tcMar>
+              <w:top w:w="80" w:type="dxa"/>
+              <w:left w:w="150" w:type="dxa"/>
+              <w:bottom w:w="80" w:type="dxa"/>
+              <w:right w:w="150" w:type="dxa"/>
+            </w:tcMar>
+            <w:vAlign w:val="center"/>
+          </w:tcPr>
+          <w:p>
+            <w:proofErr w:type="gramStart"/>
+            <w:r>
+              <w:t>Musila  and</w:t>
+            </w:r>
+            <w:proofErr w:type="gramEnd"/>
+            <w:r>
+              <w:t xml:space="preserve"> Hawwah</w:t>
             </w:r>
           </w:p>
         </w:tc>
       </w:tr>
       <w:tr>
-        <w:tblPrEx>
-          <w:tblCellMar>
-            <w:top w:w="0" w:type="dxa"/>
-            <w:bottom w:w="0" w:type="dxa"/>
-          </w:tblCellMar>
-        </w:tblPrEx>
         <w:trPr>
           <w:jc w:val="center"/>
         </w:trPr>
@@ -300,7 +278,7 @@
                 <w:sz w:val="21"/>
                 <w:szCs w:val="21"/>
               </w:rPr>
-              <w:t>Prepared By</w:t>
+              <w:t>Version</w:t>
             </w:r>
           </w:p>
         </w:tc>
@@ -313,33 +291,41 @@
               <w:bottom w:val="single" w:sz="4" w:space="0" w:color="D9DDE1"/>
               <w:right w:val="single" w:sz="4" w:space="0" w:color="D9DDE1"/>
             </w:tcBorders>
-            <w:shd w:val="clear" w:color="auto" w:fill="F4F6F8"/>
-            <w:tcMar>
-              <w:top w:w="80" w:type="dxa"/>
-              <w:left w:w="150" w:type="dxa"/>
-              <w:bottom w:w="80" w:type="dxa"/>
-              <w:right w:w="150" w:type="dxa"/>
-            </w:tcMar>
-            <w:vAlign w:val="center"/>
-          </w:tcPr>
-          <w:p>
-            <w:r>
-              <w:rPr>
-                <w:sz w:val="21"/>
-                <w:szCs w:val="21"/>
-              </w:rPr>
-              <w:t>Urban Water Solutions Initiative (UWSI)</w:t>
+            <w:shd w:val="clear" w:color="auto" w:fill="FFFFFF"/>
+            <w:tcMar>
+              <w:top w:w="80" w:type="dxa"/>
+              <w:left w:w="150" w:type="dxa"/>
+              <w:bottom w:w="80" w:type="dxa"/>
+              <w:right w:w="150" w:type="dxa"/>
+            </w:tcMar>
+            <w:vAlign w:val="center"/>
+          </w:tcPr>
+          <w:p>
+            <w:r>
+              <w:rPr>
+                <w:sz w:val="21"/>
+                <w:szCs w:val="21"/>
+              </w:rPr>
+              <w:t>2</w:t>
+            </w:r>
+            <w:r>
+              <w:rPr>
+                <w:sz w:val="21"/>
+                <w:szCs w:val="21"/>
+              </w:rPr>
+              <w:t>.0, 202</w:t>
+            </w:r>
+            <w:r>
+              <w:rPr>
+                <w:sz w:val="21"/>
+                <w:szCs w:val="21"/>
+              </w:rPr>
+              <w:t>6</w:t>
             </w:r>
           </w:p>
         </w:tc>
       </w:tr>
       <w:tr>
-        <w:tblPrEx>
-          <w:tblCellMar>
-            <w:top w:w="0" w:type="dxa"/>
-            <w:bottom w:w="0" w:type="dxa"/>
-          </w:tblCellMar>
-        </w:tblPrEx>
         <w:trPr>
           <w:jc w:val="center"/>
         </w:trPr>
@@ -352,76 +338,6 @@
               <w:bottom w:val="single" w:sz="4" w:space="0" w:color="D9DDE1"/>
               <w:right w:val="single" w:sz="4" w:space="0" w:color="D9DDE1"/>
             </w:tcBorders>
-            <w:shd w:val="clear" w:color="auto" w:fill="1A3A5C"/>
-            <w:tcMar>
-              <w:top w:w="80" w:type="dxa"/>
-              <w:left w:w="150" w:type="dxa"/>
-              <w:bottom w:w="80" w:type="dxa"/>
-              <w:right w:w="150" w:type="dxa"/>
-            </w:tcMar>
-            <w:vAlign w:val="center"/>
-          </w:tcPr>
-          <w:p>
-            <w:r>
-              <w:rPr>
-                <w:b/>
-                <w:bCs/>
-                <w:color w:val="FFFFFF"/>
-                <w:sz w:val="21"/>
-                <w:szCs w:val="21"/>
-              </w:rPr>
-              <w:t>Version</w:t>
-            </w:r>
-          </w:p>
-        </w:tc>
-        <w:tc>
-          <w:tcPr>
-            <w:tcW w:w="5400" w:type="dxa"/>
-            <w:tcBorders>
-              <w:top w:val="single" w:sz="4" w:space="0" w:color="D9DDE1"/>
-              <w:left w:val="single" w:sz="4" w:space="0" w:color="D9DDE1"/>
-              <w:bottom w:val="single" w:sz="4" w:space="0" w:color="D9DDE1"/>
-              <w:right w:val="single" w:sz="4" w:space="0" w:color="D9DDE1"/>
-            </w:tcBorders>
-            <w:shd w:val="clear" w:color="auto" w:fill="FFFFFF"/>
-            <w:tcMar>
-              <w:top w:w="80" w:type="dxa"/>
-              <w:left w:w="150" w:type="dxa"/>
-              <w:bottom w:w="80" w:type="dxa"/>
-              <w:right w:w="150" w:type="dxa"/>
-            </w:tcMar>
-            <w:vAlign w:val="center"/>
-          </w:tcPr>
-          <w:p>
-            <w:r>
-              <w:rPr>
-                <w:sz w:val="21"/>
-                <w:szCs w:val="21"/>
-              </w:rPr>
-              <w:t>1.0 — Final Draft, 2025</w:t>
-            </w:r>
-          </w:p>
-        </w:tc>
-      </w:tr>
-      <w:tr>
-        <w:tblPrEx>
-          <w:tblCellMar>
-            <w:top w:w="0" w:type="dxa"/>
-            <w:bottom w:w="0" w:type="dxa"/>
-          </w:tblCellMar>
-        </w:tblPrEx>
-        <w:trPr>
-          <w:jc w:val="center"/>
-        </w:trPr>
-        <w:tc>
-          <w:tcPr>
-            <w:tcW w:w="1800" w:type="dxa"/>
-            <w:tcBorders>
-              <w:top w:val="single" w:sz="4" w:space="0" w:color="D9DDE1"/>
-              <w:left w:val="single" w:sz="4" w:space="0" w:color="D9DDE1"/>
-              <w:bottom w:val="single" w:sz="4" w:space="0" w:color="D9DDE1"/>
-              <w:right w:val="single" w:sz="4" w:space="0" w:color="D9DDE1"/>
-            </w:tcBorders>
             <w:shd w:val="clear" w:color="auto" w:fill="009344"/>
             <w:tcMar>
               <w:top w:w="80" w:type="dxa"/>
@@ -484,35 +400,80 @@
     </w:p>
     <w:p>
       <w:pPr>
-        <w:jc w:val="center"/>
-      </w:pPr>
-      <w:r>
         <w:rPr>
           <w:i/>
           <w:iCs/>
           <w:color w:val="00838F"/>
         </w:rPr>
-        <w:t>"Water is the driving force of all nature."</w:t>
-      </w:r>
-    </w:p>
-    <w:p>
-      <w:pPr>
-        <w:spacing w:before="40"/>
-        <w:jc w:val="center"/>
-      </w:pPr>
-      <w:r>
+      </w:pPr>
+    </w:p>
+    <w:p>
+      <w:pPr>
         <w:rPr>
-          <w:color w:val="4A5568"/>
-          <w:sz w:val="20"/>
-          <w:szCs w:val="20"/>
+          <w:i/>
+          <w:iCs/>
+          <w:color w:val="00838F"/>
         </w:rPr>
-        <w:t>— Leonardo da Vinci</w:t>
-      </w:r>
-    </w:p>
-    <w:p>
-      <w:r>
-        <w:br w:type="page"/>
-      </w:r>
+      </w:pPr>
+    </w:p>
+    <w:p>
+      <w:pPr>
+        <w:rPr>
+          <w:i/>
+          <w:iCs/>
+          <w:color w:val="00838F"/>
+        </w:rPr>
+      </w:pPr>
+    </w:p>
+    <w:p>
+      <w:pPr>
+        <w:rPr>
+          <w:i/>
+          <w:iCs/>
+          <w:color w:val="00838F"/>
+        </w:rPr>
+      </w:pPr>
+    </w:p>
+    <w:p/>
+    <w:p>
+      <w:pPr>
+        <w:pStyle w:val="Heading1"/>
+        <w:pBdr>
+          <w:bottom w:val="single" w:sz="8" w:space="6" w:color="2E75B6"/>
+        </w:pBdr>
+      </w:pPr>
+    </w:p>
+    <w:p>
+      <w:pPr>
+        <w:pStyle w:val="Heading1"/>
+        <w:pBdr>
+          <w:bottom w:val="single" w:sz="8" w:space="6" w:color="2E75B6"/>
+        </w:pBdr>
+      </w:pPr>
+    </w:p>
+    <w:p>
+      <w:pPr>
+        <w:pStyle w:val="Heading1"/>
+        <w:pBdr>
+          <w:bottom w:val="single" w:sz="8" w:space="6" w:color="2E75B6"/>
+        </w:pBdr>
+      </w:pPr>
+    </w:p>
+    <w:p>
+      <w:pPr>
+        <w:pStyle w:val="Heading1"/>
+        <w:pBdr>
+          <w:bottom w:val="single" w:sz="8" w:space="6" w:color="2E75B6"/>
+        </w:pBdr>
+      </w:pPr>
+    </w:p>
+    <w:p>
+      <w:pPr>
+        <w:pStyle w:val="Heading1"/>
+        <w:pBdr>
+          <w:bottom w:val="single" w:sz="8" w:space="6" w:color="2E75B6"/>
+        </w:pBdr>
+      </w:pPr>
     </w:p>
     <w:p>
       <w:pPr>
@@ -582,12 +543,6 @@
         <w:gridCol w:w="2340"/>
       </w:tblGrid>
       <w:tr>
-        <w:tblPrEx>
-          <w:tblCellMar>
-            <w:top w:w="0" w:type="dxa"/>
-            <w:bottom w:w="0" w:type="dxa"/>
-          </w:tblCellMar>
-        </w:tblPrEx>
         <w:tc>
           <w:tcPr>
             <w:tcW w:w="2340" w:type="dxa"/>
@@ -718,12 +673,6 @@
         </w:tc>
       </w:tr>
       <w:tr>
-        <w:tblPrEx>
-          <w:tblCellMar>
-            <w:top w:w="0" w:type="dxa"/>
-            <w:bottom w:w="0" w:type="dxa"/>
-          </w:tblCellMar>
-        </w:tblPrEx>
         <w:tc>
           <w:tcPr>
             <w:tcW w:w="2340" w:type="dxa"/>
@@ -1187,12 +1136,6 @@
         <w:gridCol w:w="4100"/>
       </w:tblGrid>
       <w:tr>
-        <w:tblPrEx>
-          <w:tblCellMar>
-            <w:top w:w="0" w:type="dxa"/>
-            <w:bottom w:w="0" w:type="dxa"/>
-          </w:tblCellMar>
-        </w:tblPrEx>
         <w:tc>
           <w:tcPr>
             <w:tcW w:w="2000" w:type="dxa"/>
@@ -1291,12 +1234,6 @@
         </w:tc>
       </w:tr>
       <w:tr>
-        <w:tblPrEx>
-          <w:tblCellMar>
-            <w:top w:w="0" w:type="dxa"/>
-            <w:bottom w:w="0" w:type="dxa"/>
-          </w:tblCellMar>
-        </w:tblPrEx>
         <w:tc>
           <w:tcPr>
             <w:tcW w:w="2000" w:type="dxa"/>
@@ -1405,12 +1342,6 @@
         </w:tc>
       </w:tr>
       <w:tr>
-        <w:tblPrEx>
-          <w:tblCellMar>
-            <w:top w:w="0" w:type="dxa"/>
-            <w:bottom w:w="0" w:type="dxa"/>
-          </w:tblCellMar>
-        </w:tblPrEx>
         <w:tc>
           <w:tcPr>
             <w:tcW w:w="2000" w:type="dxa"/>
@@ -1501,12 +1432,6 @@
         </w:tc>
       </w:tr>
       <w:tr>
-        <w:tblPrEx>
-          <w:tblCellMar>
-            <w:top w:w="0" w:type="dxa"/>
-            <w:bottom w:w="0" w:type="dxa"/>
-          </w:tblCellMar>
-        </w:tblPrEx>
         <w:tc>
           <w:tcPr>
             <w:tcW w:w="2000" w:type="dxa"/>
@@ -1615,12 +1540,6 @@
         </w:tc>
       </w:tr>
       <w:tr>
-        <w:tblPrEx>
-          <w:tblCellMar>
-            <w:top w:w="0" w:type="dxa"/>
-            <w:bottom w:w="0" w:type="dxa"/>
-          </w:tblCellMar>
-        </w:tblPrEx>
         <w:tc>
           <w:tcPr>
             <w:tcW w:w="2000" w:type="dxa"/>
@@ -1711,12 +1630,6 @@
         </w:tc>
       </w:tr>
       <w:tr>
-        <w:tblPrEx>
-          <w:tblCellMar>
-            <w:top w:w="0" w:type="dxa"/>
-            <w:bottom w:w="0" w:type="dxa"/>
-          </w:tblCellMar>
-        </w:tblPrEx>
         <w:tc>
           <w:tcPr>
             <w:tcW w:w="2000" w:type="dxa"/>
@@ -1825,12 +1738,6 @@
         </w:tc>
       </w:tr>
       <w:tr>
-        <w:tblPrEx>
-          <w:tblCellMar>
-            <w:top w:w="0" w:type="dxa"/>
-            <w:bottom w:w="0" w:type="dxa"/>
-          </w:tblCellMar>
-        </w:tblPrEx>
         <w:tc>
           <w:tcPr>
             <w:tcW w:w="2000" w:type="dxa"/>
@@ -1921,12 +1828,6 @@
         </w:tc>
       </w:tr>
       <w:tr>
-        <w:tblPrEx>
-          <w:tblCellMar>
-            <w:top w:w="0" w:type="dxa"/>
-            <w:bottom w:w="0" w:type="dxa"/>
-          </w:tblCellMar>
-        </w:tblPrEx>
         <w:tc>
           <w:tcPr>
             <w:tcW w:w="2000" w:type="dxa"/>
@@ -2238,12 +2139,6 @@
         <w:gridCol w:w="1500"/>
       </w:tblGrid>
       <w:tr>
-        <w:tblPrEx>
-          <w:tblCellMar>
-            <w:top w:w="0" w:type="dxa"/>
-            <w:bottom w:w="0" w:type="dxa"/>
-          </w:tblCellMar>
-        </w:tblPrEx>
         <w:tc>
           <w:tcPr>
             <w:tcW w:w="2000" w:type="dxa"/>
@@ -2438,12 +2333,6 @@
         </w:tc>
       </w:tr>
       <w:tr>
-        <w:tblPrEx>
-          <w:tblCellMar>
-            <w:top w:w="0" w:type="dxa"/>
-            <w:bottom w:w="0" w:type="dxa"/>
-          </w:tblCellMar>
-        </w:tblPrEx>
         <w:tc>
           <w:tcPr>
             <w:tcW w:w="2000" w:type="dxa"/>
@@ -2635,12 +2524,6 @@
         </w:tc>
       </w:tr>
       <w:tr>
-        <w:tblPrEx>
-          <w:tblCellMar>
-            <w:top w:w="0" w:type="dxa"/>
-            <w:bottom w:w="0" w:type="dxa"/>
-          </w:tblCellMar>
-        </w:tblPrEx>
         <w:tc>
           <w:tcPr>
             <w:tcW w:w="2000" w:type="dxa"/>
@@ -2831,12 +2714,6 @@
         </w:tc>
       </w:tr>
       <w:tr>
-        <w:tblPrEx>
-          <w:tblCellMar>
-            <w:top w:w="0" w:type="dxa"/>
-            <w:bottom w:w="0" w:type="dxa"/>
-          </w:tblCellMar>
-        </w:tblPrEx>
         <w:tc>
           <w:tcPr>
             <w:tcW w:w="2000" w:type="dxa"/>
@@ -3027,12 +2904,6 @@
         </w:tc>
       </w:tr>
       <w:tr>
-        <w:tblPrEx>
-          <w:tblCellMar>
-            <w:top w:w="0" w:type="dxa"/>
-            <w:bottom w:w="0" w:type="dxa"/>
-          </w:tblCellMar>
-        </w:tblPrEx>
         <w:tc>
           <w:tcPr>
             <w:tcW w:w="2000" w:type="dxa"/>
@@ -3223,12 +3094,6 @@
         </w:tc>
       </w:tr>
       <w:tr>
-        <w:tblPrEx>
-          <w:tblCellMar>
-            <w:top w:w="0" w:type="dxa"/>
-            <w:bottom w:w="0" w:type="dxa"/>
-          </w:tblCellMar>
-        </w:tblPrEx>
         <w:tc>
           <w:tcPr>
             <w:tcW w:w="2000" w:type="dxa"/>
@@ -3419,12 +3284,6 @@
         </w:tc>
       </w:tr>
       <w:tr>
-        <w:tblPrEx>
-          <w:tblCellMar>
-            <w:top w:w="0" w:type="dxa"/>
-            <w:bottom w:w="0" w:type="dxa"/>
-          </w:tblCellMar>
-        </w:tblPrEx>
         <w:tc>
           <w:tcPr>
             <w:tcW w:w="2000" w:type="dxa"/>
@@ -3778,12 +3637,6 @@
         <w:gridCol w:w="3000"/>
       </w:tblGrid>
       <w:tr>
-        <w:tblPrEx>
-          <w:tblCellMar>
-            <w:top w:w="0" w:type="dxa"/>
-            <w:bottom w:w="0" w:type="dxa"/>
-          </w:tblCellMar>
-        </w:tblPrEx>
         <w:tc>
           <w:tcPr>
             <w:tcW w:w="1200" w:type="dxa"/>
@@ -3914,12 +3767,6 @@
         </w:tc>
       </w:tr>
       <w:tr>
-        <w:tblPrEx>
-          <w:tblCellMar>
-            <w:top w:w="0" w:type="dxa"/>
-            <w:bottom w:w="0" w:type="dxa"/>
-          </w:tblCellMar>
-        </w:tblPrEx>
         <w:tc>
           <w:tcPr>
             <w:tcW w:w="1200" w:type="dxa"/>
@@ -4044,12 +3891,6 @@
         </w:tc>
       </w:tr>
       <w:tr>
-        <w:tblPrEx>
-          <w:tblCellMar>
-            <w:top w:w="0" w:type="dxa"/>
-            <w:bottom w:w="0" w:type="dxa"/>
-          </w:tblCellMar>
-        </w:tblPrEx>
         <w:tc>
           <w:tcPr>
             <w:tcW w:w="1200" w:type="dxa"/>
@@ -4174,12 +4015,6 @@
         </w:tc>
       </w:tr>
       <w:tr>
-        <w:tblPrEx>
-          <w:tblCellMar>
-            <w:top w:w="0" w:type="dxa"/>
-            <w:bottom w:w="0" w:type="dxa"/>
-          </w:tblCellMar>
-        </w:tblPrEx>
         <w:tc>
           <w:tcPr>
             <w:tcW w:w="1200" w:type="dxa"/>
@@ -4304,12 +4139,6 @@
         </w:tc>
       </w:tr>
       <w:tr>
-        <w:tblPrEx>
-          <w:tblCellMar>
-            <w:top w:w="0" w:type="dxa"/>
-            <w:bottom w:w="0" w:type="dxa"/>
-          </w:tblCellMar>
-        </w:tblPrEx>
         <w:tc>
           <w:tcPr>
             <w:tcW w:w="1200" w:type="dxa"/>
@@ -4700,12 +4529,6 @@
         <w:gridCol w:w="2080"/>
       </w:tblGrid>
       <w:tr>
-        <w:tblPrEx>
-          <w:tblCellMar>
-            <w:top w:w="0" w:type="dxa"/>
-            <w:bottom w:w="0" w:type="dxa"/>
-          </w:tblCellMar>
-        </w:tblPrEx>
         <w:tc>
           <w:tcPr>
             <w:tcW w:w="3120" w:type="dxa"/>
@@ -4836,12 +4659,6 @@
         </w:tc>
       </w:tr>
       <w:tr>
-        <w:tblPrEx>
-          <w:tblCellMar>
-            <w:top w:w="0" w:type="dxa"/>
-            <w:bottom w:w="0" w:type="dxa"/>
-          </w:tblCellMar>
-        </w:tblPrEx>
         <w:tc>
           <w:tcPr>
             <w:tcW w:w="3120" w:type="dxa"/>
@@ -4973,12 +4790,6 @@
         </w:tc>
       </w:tr>
       <w:tr>
-        <w:tblPrEx>
-          <w:tblCellMar>
-            <w:top w:w="0" w:type="dxa"/>
-            <w:bottom w:w="0" w:type="dxa"/>
-          </w:tblCellMar>
-        </w:tblPrEx>
         <w:tc>
           <w:tcPr>
             <w:tcW w:w="3120" w:type="dxa"/>
@@ -5110,12 +4921,6 @@
         </w:tc>
       </w:tr>
       <w:tr>
-        <w:tblPrEx>
-          <w:tblCellMar>
-            <w:top w:w="0" w:type="dxa"/>
-            <w:bottom w:w="0" w:type="dxa"/>
-          </w:tblCellMar>
-        </w:tblPrEx>
         <w:tc>
           <w:tcPr>
             <w:tcW w:w="3120" w:type="dxa"/>
@@ -5247,12 +5052,6 @@
         </w:tc>
       </w:tr>
       <w:tr>
-        <w:tblPrEx>
-          <w:tblCellMar>
-            <w:top w:w="0" w:type="dxa"/>
-            <w:bottom w:w="0" w:type="dxa"/>
-          </w:tblCellMar>
-        </w:tblPrEx>
         <w:tc>
           <w:tcPr>
             <w:tcW w:w="3120" w:type="dxa"/>
@@ -5422,12 +5221,6 @@
         </w:tc>
       </w:tr>
       <w:tr>
-        <w:tblPrEx>
-          <w:tblCellMar>
-            <w:top w:w="0" w:type="dxa"/>
-            <w:bottom w:w="0" w:type="dxa"/>
-          </w:tblCellMar>
-        </w:tblPrEx>
         <w:tc>
           <w:tcPr>
             <w:tcW w:w="3120" w:type="dxa"/>
@@ -5597,12 +5390,6 @@
         </w:tc>
       </w:tr>
       <w:tr>
-        <w:tblPrEx>
-          <w:tblCellMar>
-            <w:top w:w="0" w:type="dxa"/>
-            <w:bottom w:w="0" w:type="dxa"/>
-          </w:tblCellMar>
-        </w:tblPrEx>
         <w:tc>
           <w:tcPr>
             <w:tcW w:w="3120" w:type="dxa"/>
@@ -5734,12 +5521,6 @@
         </w:tc>
       </w:tr>
       <w:tr>
-        <w:tblPrEx>
-          <w:tblCellMar>
-            <w:top w:w="0" w:type="dxa"/>
-            <w:bottom w:w="0" w:type="dxa"/>
-          </w:tblCellMar>
-        </w:tblPrEx>
         <w:tc>
           <w:tcPr>
             <w:tcW w:w="3120" w:type="dxa"/>
@@ -5871,12 +5652,6 @@
         </w:tc>
       </w:tr>
       <w:tr>
-        <w:tblPrEx>
-          <w:tblCellMar>
-            <w:top w:w="0" w:type="dxa"/>
-            <w:bottom w:w="0" w:type="dxa"/>
-          </w:tblCellMar>
-        </w:tblPrEx>
         <w:tc>
           <w:tcPr>
             <w:tcW w:w="3120" w:type="dxa"/>
@@ -6008,12 +5783,6 @@
         </w:tc>
       </w:tr>
       <w:tr>
-        <w:tblPrEx>
-          <w:tblCellMar>
-            <w:top w:w="0" w:type="dxa"/>
-            <w:bottom w:w="0" w:type="dxa"/>
-          </w:tblCellMar>
-        </w:tblPrEx>
         <w:tc>
           <w:tcPr>
             <w:tcW w:w="3120" w:type="dxa"/>
@@ -6215,12 +5984,6 @@
         <w:gridCol w:w="5560"/>
       </w:tblGrid>
       <w:tr>
-        <w:tblPrEx>
-          <w:tblCellMar>
-            <w:top w:w="0" w:type="dxa"/>
-            <w:bottom w:w="0" w:type="dxa"/>
-          </w:tblCellMar>
-        </w:tblPrEx>
         <w:tc>
           <w:tcPr>
             <w:tcW w:w="1200" w:type="dxa"/>
@@ -6319,12 +6082,6 @@
         </w:tc>
       </w:tr>
       <w:tr>
-        <w:tblPrEx>
-          <w:tblCellMar>
-            <w:top w:w="0" w:type="dxa"/>
-            <w:bottom w:w="0" w:type="dxa"/>
-          </w:tblCellMar>
-        </w:tblPrEx>
         <w:tc>
           <w:tcPr>
             <w:tcW w:w="1200" w:type="dxa"/>
@@ -6420,12 +6177,6 @@
         </w:tc>
       </w:tr>
       <w:tr>
-        <w:tblPrEx>
-          <w:tblCellMar>
-            <w:top w:w="0" w:type="dxa"/>
-            <w:bottom w:w="0" w:type="dxa"/>
-          </w:tblCellMar>
-        </w:tblPrEx>
         <w:tc>
           <w:tcPr>
             <w:tcW w:w="1200" w:type="dxa"/>
@@ -6553,12 +6304,6 @@
         </w:tc>
       </w:tr>
       <w:tr>
-        <w:tblPrEx>
-          <w:tblCellMar>
-            <w:top w:w="0" w:type="dxa"/>
-            <w:bottom w:w="0" w:type="dxa"/>
-          </w:tblCellMar>
-        </w:tblPrEx>
         <w:tc>
           <w:tcPr>
             <w:tcW w:w="1200" w:type="dxa"/>
@@ -6654,12 +6399,6 @@
         </w:tc>
       </w:tr>
       <w:tr>
-        <w:tblPrEx>
-          <w:tblCellMar>
-            <w:top w:w="0" w:type="dxa"/>
-            <w:bottom w:w="0" w:type="dxa"/>
-          </w:tblCellMar>
-        </w:tblPrEx>
         <w:tc>
           <w:tcPr>
             <w:tcW w:w="1200" w:type="dxa"/>
@@ -6755,12 +6494,6 @@
         </w:tc>
       </w:tr>
       <w:tr>
-        <w:tblPrEx>
-          <w:tblCellMar>
-            <w:top w:w="0" w:type="dxa"/>
-            <w:bottom w:w="0" w:type="dxa"/>
-          </w:tblCellMar>
-        </w:tblPrEx>
         <w:tc>
           <w:tcPr>
             <w:tcW w:w="1200" w:type="dxa"/>
@@ -6856,12 +6589,6 @@
         </w:tc>
       </w:tr>
       <w:tr>
-        <w:tblPrEx>
-          <w:tblCellMar>
-            <w:top w:w="0" w:type="dxa"/>
-            <w:bottom w:w="0" w:type="dxa"/>
-          </w:tblCellMar>
-        </w:tblPrEx>
         <w:tc>
           <w:tcPr>
             <w:tcW w:w="1200" w:type="dxa"/>
@@ -7352,12 +7079,6 @@
         <w:gridCol w:w="2560"/>
       </w:tblGrid>
       <w:tr>
-        <w:tblPrEx>
-          <w:tblCellMar>
-            <w:top w:w="0" w:type="dxa"/>
-            <w:bottom w:w="0" w:type="dxa"/>
-          </w:tblCellMar>
-        </w:tblPrEx>
         <w:tc>
           <w:tcPr>
             <w:tcW w:w="2800" w:type="dxa"/>
@@ -7488,12 +7209,6 @@
         </w:tc>
       </w:tr>
       <w:tr>
-        <w:tblPrEx>
-          <w:tblCellMar>
-            <w:top w:w="0" w:type="dxa"/>
-            <w:bottom w:w="0" w:type="dxa"/>
-          </w:tblCellMar>
-        </w:tblPrEx>
         <w:tc>
           <w:tcPr>
             <w:tcW w:w="2800" w:type="dxa"/>
@@ -7621,12 +7336,6 @@
         </w:tc>
       </w:tr>
       <w:tr>
-        <w:tblPrEx>
-          <w:tblCellMar>
-            <w:top w:w="0" w:type="dxa"/>
-            <w:bottom w:w="0" w:type="dxa"/>
-          </w:tblCellMar>
-        </w:tblPrEx>
         <w:tc>
           <w:tcPr>
             <w:tcW w:w="2800" w:type="dxa"/>
@@ -7754,12 +7463,6 @@
         </w:tc>
       </w:tr>
       <w:tr>
-        <w:tblPrEx>
-          <w:tblCellMar>
-            <w:top w:w="0" w:type="dxa"/>
-            <w:bottom w:w="0" w:type="dxa"/>
-          </w:tblCellMar>
-        </w:tblPrEx>
         <w:tc>
           <w:tcPr>
             <w:tcW w:w="2800" w:type="dxa"/>
@@ -7887,12 +7590,6 @@
         </w:tc>
       </w:tr>
       <w:tr>
-        <w:tblPrEx>
-          <w:tblCellMar>
-            <w:top w:w="0" w:type="dxa"/>
-            <w:bottom w:w="0" w:type="dxa"/>
-          </w:tblCellMar>
-        </w:tblPrEx>
         <w:tc>
           <w:tcPr>
             <w:tcW w:w="2800" w:type="dxa"/>
@@ -8020,12 +7717,6 @@
         </w:tc>
       </w:tr>
       <w:tr>
-        <w:tblPrEx>
-          <w:tblCellMar>
-            <w:top w:w="0" w:type="dxa"/>
-            <w:bottom w:w="0" w:type="dxa"/>
-          </w:tblCellMar>
-        </w:tblPrEx>
         <w:tc>
           <w:tcPr>
             <w:tcW w:w="2800" w:type="dxa"/>
@@ -8348,12 +8039,6 @@
         <w:gridCol w:w="5360"/>
       </w:tblGrid>
       <w:tr>
-        <w:tblPrEx>
-          <w:tblCellMar>
-            <w:top w:w="0" w:type="dxa"/>
-            <w:bottom w:w="0" w:type="dxa"/>
-          </w:tblCellMar>
-        </w:tblPrEx>
         <w:tc>
           <w:tcPr>
             <w:tcW w:w="2800" w:type="dxa"/>
@@ -8452,12 +8137,6 @@
         </w:tc>
       </w:tr>
       <w:tr>
-        <w:tblPrEx>
-          <w:tblCellMar>
-            <w:top w:w="0" w:type="dxa"/>
-            <w:bottom w:w="0" w:type="dxa"/>
-          </w:tblCellMar>
-        </w:tblPrEx>
         <w:tc>
           <w:tcPr>
             <w:tcW w:w="2800" w:type="dxa"/>
@@ -8571,12 +8250,6 @@
         </w:tc>
       </w:tr>
       <w:tr>
-        <w:tblPrEx>
-          <w:tblCellMar>
-            <w:top w:w="0" w:type="dxa"/>
-            <w:bottom w:w="0" w:type="dxa"/>
-          </w:tblCellMar>
-        </w:tblPrEx>
         <w:tc>
           <w:tcPr>
             <w:tcW w:w="2800" w:type="dxa"/>
@@ -8672,12 +8345,6 @@
         </w:tc>
       </w:tr>
       <w:tr>
-        <w:tblPrEx>
-          <w:tblCellMar>
-            <w:top w:w="0" w:type="dxa"/>
-            <w:bottom w:w="0" w:type="dxa"/>
-          </w:tblCellMar>
-        </w:tblPrEx>
         <w:tc>
           <w:tcPr>
             <w:tcW w:w="2800" w:type="dxa"/>
@@ -8773,12 +8440,6 @@
         </w:tc>
       </w:tr>
       <w:tr>
-        <w:tblPrEx>
-          <w:tblCellMar>
-            <w:top w:w="0" w:type="dxa"/>
-            <w:bottom w:w="0" w:type="dxa"/>
-          </w:tblCellMar>
-        </w:tblPrEx>
         <w:tc>
           <w:tcPr>
             <w:tcW w:w="2800" w:type="dxa"/>
@@ -8894,12 +8555,6 @@
         </w:tc>
       </w:tr>
       <w:tr>
-        <w:tblPrEx>
-          <w:tblCellMar>
-            <w:top w:w="0" w:type="dxa"/>
-            <w:bottom w:w="0" w:type="dxa"/>
-          </w:tblCellMar>
-        </w:tblPrEx>
         <w:tc>
           <w:tcPr>
             <w:tcW w:w="2800" w:type="dxa"/>
@@ -8995,12 +8650,6 @@
         </w:tc>
       </w:tr>
       <w:tr>
-        <w:tblPrEx>
-          <w:tblCellMar>
-            <w:top w:w="0" w:type="dxa"/>
-            <w:bottom w:w="0" w:type="dxa"/>
-          </w:tblCellMar>
-        </w:tblPrEx>
         <w:tc>
           <w:tcPr>
             <w:tcW w:w="2800" w:type="dxa"/>
@@ -9096,12 +8745,6 @@
         </w:tc>
       </w:tr>
       <w:tr>
-        <w:tblPrEx>
-          <w:tblCellMar>
-            <w:top w:w="0" w:type="dxa"/>
-            <w:bottom w:w="0" w:type="dxa"/>
-          </w:tblCellMar>
-        </w:tblPrEx>
         <w:tc>
           <w:tcPr>
             <w:tcW w:w="2800" w:type="dxa"/>
@@ -9426,12 +9069,6 @@
         <w:gridCol w:w="4080"/>
       </w:tblGrid>
       <w:tr>
-        <w:tblPrEx>
-          <w:tblCellMar>
-            <w:top w:w="0" w:type="dxa"/>
-            <w:bottom w:w="0" w:type="dxa"/>
-          </w:tblCellMar>
-        </w:tblPrEx>
         <w:tc>
           <w:tcPr>
             <w:tcW w:w="3200" w:type="dxa"/>
@@ -9530,12 +9167,6 @@
         </w:tc>
       </w:tr>
       <w:tr>
-        <w:tblPrEx>
-          <w:tblCellMar>
-            <w:top w:w="0" w:type="dxa"/>
-            <w:bottom w:w="0" w:type="dxa"/>
-          </w:tblCellMar>
-        </w:tblPrEx>
         <w:tc>
           <w:tcPr>
             <w:tcW w:w="3200" w:type="dxa"/>
@@ -9631,12 +9262,6 @@
         </w:tc>
       </w:tr>
       <w:tr>
-        <w:tblPrEx>
-          <w:tblCellMar>
-            <w:top w:w="0" w:type="dxa"/>
-            <w:bottom w:w="0" w:type="dxa"/>
-          </w:tblCellMar>
-        </w:tblPrEx>
         <w:tc>
           <w:tcPr>
             <w:tcW w:w="3200" w:type="dxa"/>
@@ -9732,12 +9357,6 @@
         </w:tc>
       </w:tr>
       <w:tr>
-        <w:tblPrEx>
-          <w:tblCellMar>
-            <w:top w:w="0" w:type="dxa"/>
-            <w:bottom w:w="0" w:type="dxa"/>
-          </w:tblCellMar>
-        </w:tblPrEx>
         <w:tc>
           <w:tcPr>
             <w:tcW w:w="3200" w:type="dxa"/>
@@ -9833,12 +9452,6 @@
         </w:tc>
       </w:tr>
       <w:tr>
-        <w:tblPrEx>
-          <w:tblCellMar>
-            <w:top w:w="0" w:type="dxa"/>
-            <w:bottom w:w="0" w:type="dxa"/>
-          </w:tblCellMar>
-        </w:tblPrEx>
         <w:tc>
           <w:tcPr>
             <w:tcW w:w="3200" w:type="dxa"/>
@@ -9934,12 +9547,6 @@
         </w:tc>
       </w:tr>
       <w:tr>
-        <w:tblPrEx>
-          <w:tblCellMar>
-            <w:top w:w="0" w:type="dxa"/>
-            <w:bottom w:w="0" w:type="dxa"/>
-          </w:tblCellMar>
-        </w:tblPrEx>
         <w:tc>
           <w:tcPr>
             <w:tcW w:w="3200" w:type="dxa"/>
@@ -10046,12 +9653,6 @@
         </w:tc>
       </w:tr>
       <w:tr>
-        <w:tblPrEx>
-          <w:tblCellMar>
-            <w:top w:w="0" w:type="dxa"/>
-            <w:bottom w:w="0" w:type="dxa"/>
-          </w:tblCellMar>
-        </w:tblPrEx>
         <w:tc>
           <w:tcPr>
             <w:tcW w:w="3200" w:type="dxa"/>
@@ -10147,12 +9748,6 @@
         </w:tc>
       </w:tr>
       <w:tr>
-        <w:tblPrEx>
-          <w:tblCellMar>
-            <w:top w:w="0" w:type="dxa"/>
-            <w:bottom w:w="0" w:type="dxa"/>
-          </w:tblCellMar>
-        </w:tblPrEx>
         <w:tc>
           <w:tcPr>
             <w:tcW w:w="3200" w:type="dxa"/>

</xml_diff>